<commit_message>
session1: board-verified examples, calmer screen refresh, public README
Session 1 examples run on the TESAIoT Dev Kit (fw 2.4.1) from flash after a
soft reset, the same path Program to Device uses. Buttons follow the board
silkscreen (SW5 lower, SW6 upper), charts draw smooth lines, the screen
refreshes every 500 ms and the pump spinner is gone to stop flicker.
README rewritten as the public course page.
</commit_message>
<xml_diff>
--- a/s1/sf-s1-th.docx
+++ b/s1/sf-s1-th.docx
@@ -391,12 +391,12 @@
           <w:i w:val="0"/>
           <w:color w:val="2E5496"/>
         </w:rPr>
-        <w:t>2. เตรียมบอร์ด (10 นาทีแรก — ทำครั้งเดียว)</w:t>
+        <w:t>2. เตรียมบอร์ด (20 นาทีแรก — ทุกคนทำ ทุกกลุ่มแฟลชเอง)</w:t>
       </w:r>
     </w:p>
     <w:p>
       <w:pPr>
-        <w:pStyle w:val="ListBullet"/>
+        <w:pStyle w:val="ListNumber"/>
         <w:spacing w:after="60"/>
       </w:pPr>
       <w:r>
@@ -405,7 +405,61 @@
           <w:b w:val="0"/>
           <w:i w:val="0"/>
         </w:rPr>
-        <w:t xml:space="preserve">[ ] เสียบสาย USB-C เข้าพอร์ต </w:t>
+        <w:t xml:space="preserve">[ ] </w:t>
+      </w:r>
+      <w:r>
+        <w:rPr>
+          <w:rFonts w:ascii="TH Sarabun New" w:hAnsi="TH Sarabun New" w:cs="TH Sarabun New" w:eastAsia="TH Sarabun New"/>
+          <w:b/>
+          <w:i w:val="0"/>
+        </w:rPr>
+        <w:t>ดาวน์โหลดและติดตั้ง TESAIoT PSE84 Programmer</w:t>
+      </w:r>
+      <w:r>
+        <w:rPr>
+          <w:rFonts w:ascii="TH Sarabun New" w:hAnsi="TH Sarabun New" w:cs="TH Sarabun New" w:eastAsia="TH Sarabun New"/>
+          <w:b w:val="0"/>
+          <w:i w:val="0"/>
+        </w:rPr>
+        <w:t xml:space="preserve"> จาก </w:t>
+      </w:r>
+      <w:r>
+        <w:rPr>
+          <w:rFonts w:ascii="TH Sarabun New" w:hAnsi="TH Sarabun New" w:cs="TH Sarabun New" w:eastAsia="TH Sarabun New"/>
+          <w:b/>
+          <w:i w:val="0"/>
+        </w:rPr>
+        <w:t>github.com/wiroon/TESAIoT_PSE84_Programmer/releases</w:t>
+      </w:r>
+      <w:r>
+        <w:rPr>
+          <w:rFonts w:ascii="TH Sarabun New" w:hAnsi="TH Sarabun New" w:cs="TH Sarabun New" w:eastAsia="TH Sarabun New"/>
+          <w:b w:val="0"/>
+          <w:i w:val="0"/>
+        </w:rPr>
+        <w:t xml:space="preserve"> (เลือกไฟล์ให้ตรงกับเครื่อง macOS หรือ Windows) แล้ว </w:t>
+      </w:r>
+      <w:r>
+        <w:rPr>
+          <w:rFonts w:ascii="TH Sarabun New" w:hAnsi="TH Sarabun New" w:cs="TH Sarabun New" w:eastAsia="TH Sarabun New"/>
+          <w:b/>
+          <w:i w:val="0"/>
+        </w:rPr>
+        <w:t>เปิดโปรแกรมค้างไว้</w:t>
+      </w:r>
+    </w:p>
+    <w:p>
+      <w:pPr>
+        <w:pStyle w:val="ListNumber"/>
+        <w:spacing w:after="60"/>
+      </w:pPr>
+      <w:r>
+        <w:rPr>
+          <w:rFonts w:ascii="TH Sarabun New" w:hAnsi="TH Sarabun New" w:cs="TH Sarabun New" w:eastAsia="TH Sarabun New"/>
+          <w:b w:val="0"/>
+          <w:i w:val="0"/>
+        </w:rPr>
+        <w:t xml:space="preserve">[ ] เสียบบอร์ดด้วยสาย USB-C เข้าพอร์ต </w:t>
       </w:r>
       <w:r>
         <w:rPr>
@@ -415,18 +469,10 @@
         </w:rPr>
         <w:t>KitProg3</w:t>
       </w:r>
-      <w:r>
-        <w:rPr>
-          <w:rFonts w:ascii="TH Sarabun New" w:hAnsi="TH Sarabun New" w:cs="TH Sarabun New" w:eastAsia="TH Sarabun New"/>
-          <w:b w:val="0"/>
-          <w:i w:val="0"/>
-        </w:rPr>
-        <w:t xml:space="preserve"> ของบอร์ด (ถ้าบอร์ดติดไฟแต่คอมไม่เห็น ให้เปลี่ยนสาย)</w:t>
-      </w:r>
     </w:p>
     <w:p>
       <w:pPr>
-        <w:pStyle w:val="ListBullet"/>
+        <w:pStyle w:val="ListNumber"/>
         <w:spacing w:after="60"/>
       </w:pPr>
       <w:r>
@@ -444,6 +490,38 @@
           <w:i w:val="0"/>
         </w:rPr>
         <w:t>BENTO IDE</w:t>
+      </w:r>
+      <w:r>
+        <w:rPr>
+          <w:rFonts w:ascii="TH Sarabun New" w:hAnsi="TH Sarabun New" w:cs="TH Sarabun New" w:eastAsia="TH Sarabun New"/>
+          <w:b w:val="0"/>
+          <w:i w:val="0"/>
+        </w:rPr>
+        <w:t xml:space="preserve"> ที่ </w:t>
+      </w:r>
+      <w:r>
+        <w:rPr>
+          <w:rFonts w:ascii="TH Sarabun New" w:hAnsi="TH Sarabun New" w:cs="TH Sarabun New" w:eastAsia="TH Sarabun New"/>
+          <w:b/>
+          <w:i w:val="0"/>
+        </w:rPr>
+        <w:t>https://ide.tesaiot.com/</w:t>
+      </w:r>
+      <w:r>
+        <w:rPr>
+          <w:rFonts w:ascii="TH Sarabun New" w:hAnsi="TH Sarabun New" w:cs="TH Sarabun New" w:eastAsia="TH Sarabun New"/>
+          <w:b w:val="0"/>
+          <w:i w:val="0"/>
+        </w:rPr>
+        <w:t xml:space="preserve"> ด้วย </w:t>
+      </w:r>
+      <w:r>
+        <w:rPr>
+          <w:rFonts w:ascii="TH Sarabun New" w:hAnsi="TH Sarabun New" w:cs="TH Sarabun New" w:eastAsia="TH Sarabun New"/>
+          <w:b/>
+          <w:i w:val="0"/>
+        </w:rPr>
+        <w:t>Chrome หรือ Edge</w:t>
       </w:r>
       <w:r>
         <w:rPr>
@@ -499,12 +577,20 @@
           <w:b w:val="0"/>
           <w:i w:val="0"/>
         </w:rPr>
-        <w:t xml:space="preserve"> → Flash</w:t>
+        <w:t xml:space="preserve"> → จับคู่กับ Programmer ตามที่หน้าจอบอก → </w:t>
+      </w:r>
+      <w:r>
+        <w:rPr>
+          <w:rFonts w:ascii="TH Sarabun New" w:hAnsi="TH Sarabun New" w:cs="TH Sarabun New" w:eastAsia="TH Sarabun New"/>
+          <w:b/>
+          <w:i w:val="0"/>
+        </w:rPr>
+        <w:t>Flash</w:t>
       </w:r>
     </w:p>
     <w:p>
       <w:pPr>
-        <w:pStyle w:val="ListBullet"/>
+        <w:pStyle w:val="ListNumber"/>
         <w:spacing w:after="60"/>
       </w:pPr>
       <w:r>
@@ -513,7 +599,7 @@
           <w:b w:val="0"/>
           <w:i w:val="0"/>
         </w:rPr>
-        <w:t xml:space="preserve">[ ] กด Connect แล้วดูว่าจอบอร์ดขึ้น </w:t>
+        <w:t xml:space="preserve">[ ] รอจนเสร็จ ดูมุมจอบอร์ดว่าขึ้น </w:t>
       </w:r>
       <w:r>
         <w:rPr>
@@ -526,7 +612,37 @@
     </w:p>
     <w:p>
       <w:pPr>
-        <w:pStyle w:val="ListBullet"/>
+        <w:pStyle w:val="ListNumber"/>
+        <w:spacing w:after="60"/>
+      </w:pPr>
+      <w:r>
+        <w:rPr>
+          <w:rFonts w:ascii="TH Sarabun New" w:hAnsi="TH Sarabun New" w:cs="TH Sarabun New" w:eastAsia="TH Sarabun New"/>
+          <w:b w:val="0"/>
+          <w:i w:val="0"/>
+        </w:rPr>
+        <w:t xml:space="preserve">[ ] กด </w:t>
+      </w:r>
+      <w:r>
+        <w:rPr>
+          <w:rFonts w:ascii="TH Sarabun New" w:hAnsi="TH Sarabun New" w:cs="TH Sarabun New" w:eastAsia="TH Sarabun New"/>
+          <w:b/>
+          <w:i w:val="0"/>
+        </w:rPr>
+        <w:t>Connect</w:t>
+      </w:r>
+      <w:r>
+        <w:rPr>
+          <w:rFonts w:ascii="TH Sarabun New" w:hAnsi="TH Sarabun New" w:cs="TH Sarabun New" w:eastAsia="TH Sarabun New"/>
+          <w:b w:val="0"/>
+          <w:i w:val="0"/>
+        </w:rPr>
+        <w:t xml:space="preserve"> ใน IDE</w:t>
+      </w:r>
+    </w:p>
+    <w:p>
+      <w:pPr>
+        <w:pStyle w:val="ListNumber"/>
         <w:spacing w:after="60"/>
       </w:pPr>
       <w:r>
@@ -567,21 +683,7 @@
           <w:b w:val="0"/>
           <w:i w:val="0"/>
         </w:rPr>
-        <w:t xml:space="preserve"> (SW2 คือสวิตช์ตัดไฟ)</w:t>
-      </w:r>
-    </w:p>
-    <w:p>
-      <w:pPr>
-        <w:pStyle w:val="ListBullet"/>
-        <w:spacing w:after="60"/>
-      </w:pPr>
-      <w:r>
-        <w:rPr>
-          <w:rFonts w:ascii="TH Sarabun New" w:hAnsi="TH Sarabun New" w:cs="TH Sarabun New" w:eastAsia="TH Sarabun New"/>
-          <w:b w:val="0"/>
-          <w:i w:val="0"/>
-        </w:rPr>
-        <w:t xml:space="preserve">[ ] เปิด </w:t>
+        <w:t xml:space="preserve"> (SW2 คือสวิตช์ตัดไฟ) · เปิด </w:t>
       </w:r>
       <w:r>
         <w:rPr>
@@ -610,6 +712,31 @@
         <w:spacing w:before="120" w:after="160" w:line="274" w:lineRule="auto"/>
         <w:ind w:left="283" w:right="113"/>
       </w:pPr>
+      <w:r>
+        <w:rPr>
+          <w:rFonts w:ascii="TH Sarabun New" w:hAnsi="TH Sarabun New" w:cs="TH Sarabun New" w:eastAsia="TH Sarabun New"/>
+          <w:b/>
+          <w:i/>
+          <w:color w:val="5B616B"/>
+        </w:rPr>
+        <w:t>ติดขัด?</w:t>
+      </w:r>
+      <w:r>
+        <w:rPr>
+          <w:rFonts w:ascii="TH Sarabun New" w:hAnsi="TH Sarabun New" w:cs="TH Sarabun New" w:eastAsia="TH Sarabun New"/>
+          <w:b w:val="0"/>
+          <w:i/>
+          <w:color w:val="5B616B"/>
+        </w:rPr>
+        <w:t xml:space="preserve"> macOS/Windows เตือนตอนเปิดโปรแกรม Programmer = ให้ถามผู้สอน · คอมไม่เห็นบอร์ด = เปลี่ยนสาย USB-C (ต้องเป็นสายส่งข้อมูลได้) หรือเปลี่ยนพอร์ต · แฟลชเสร็จแล้วจอดำ = กด RESET แล้วถอดสายเสียบใหม่</w:t>
+      </w:r>
+      <w:r>
+        <w:rPr>
+          <w:rFonts w:ascii="TH Sarabun New" w:hAnsi="TH Sarabun New" w:cs="TH Sarabun New" w:eastAsia="TH Sarabun New"/>
+          <w:i/>
+        </w:rPr>
+        <w:br/>
+      </w:r>
       <w:r>
         <w:rPr>
           <w:rFonts w:ascii="TH Sarabun New" w:hAnsi="TH Sarabun New" w:cs="TH Sarabun New" w:eastAsia="TH Sarabun New"/>
@@ -1289,7 +1416,7 @@
                 <w:b w:val="0"/>
                 <w:i w:val="0"/>
               </w:rPr>
-              <w:t>ปุ่มกด SW4, SW5 บนฐานบอร์ด</w:t>
+              <w:t>ปุ่มกด SW5 (ปุ่มล่าง), SW6 (ปุ่มบน) บนฐานบอร์ด</w:t>
             </w:r>
           </w:p>
         </w:tc>
@@ -1379,7 +1506,7 @@
                 <w:b w:val="0"/>
                 <w:i w:val="0"/>
               </w:rPr>
-              <w:t xml:space="preserve"> ที่คอยอ่านทุก 20 ms จึงไม่พลาดการแตะสั้น ๆ)</w:t>
+              <w:t xml:space="preserve"> ที่คอยอ่านทุก 20 ms จึงไม่พลาดการแตะสั้น ๆ · เลข 0 = SW5 (ปุ่มล่าง), 1 = SW6 (ปุ่มบน))</w:t>
             </w:r>
           </w:p>
         </w:tc>
@@ -1575,87 +1702,6 @@
           <w:color w:val="5B616B"/>
         </w:rPr>
         <w:t xml:space="preserve"> บนฐานบอร์ดคือสวิตช์ตัดไฟ ไม่ใช่ปุ่มของเรา กดแล้วบอร์ดดับ</w:t>
-      </w:r>
-      <w:r>
-        <w:rPr>
-          <w:rFonts w:ascii="TH Sarabun New" w:hAnsi="TH Sarabun New" w:cs="TH Sarabun New" w:eastAsia="TH Sarabun New"/>
-          <w:i/>
-        </w:rPr>
-        <w:br/>
-      </w:r>
-      <w:r>
-        <w:rPr>
-          <w:rFonts w:ascii="TH Sarabun New" w:hAnsi="TH Sarabun New" w:cs="TH Sarabun New" w:eastAsia="TH Sarabun New"/>
-          <w:b w:val="0"/>
-          <w:i/>
-          <w:color w:val="5B616B"/>
-        </w:rPr>
-        <w:t xml:space="preserve">หน้า </w:t>
-      </w:r>
-      <w:r>
-        <w:rPr>
-          <w:rFonts w:ascii="TH Sarabun New" w:hAnsi="TH Sarabun New" w:cs="TH Sarabun New" w:eastAsia="TH Sarabun New"/>
-          <w:b/>
-          <w:i/>
-          <w:color w:val="5B616B"/>
-        </w:rPr>
-        <w:t>GPIO &amp; RGB Matrix</w:t>
-      </w:r>
-      <w:r>
-        <w:rPr>
-          <w:rFonts w:ascii="TH Sarabun New" w:hAnsi="TH Sarabun New" w:cs="TH Sarabun New" w:eastAsia="TH Sarabun New"/>
-          <w:b w:val="0"/>
-          <w:i/>
-          <w:color w:val="5B616B"/>
-        </w:rPr>
-        <w:t xml:space="preserve"> ในเมนูบอร์ดเรียกปุ่มสองตัวนี้ว่า SW5/SW6 — ให้ยึดชื่อที่พิมพ์บนบอร์ด (</w:t>
-      </w:r>
-      <w:r>
-        <w:rPr>
-          <w:rFonts w:ascii="TH Sarabun New" w:hAnsi="TH Sarabun New" w:cs="TH Sarabun New" w:eastAsia="TH Sarabun New"/>
-          <w:b/>
-          <w:i/>
-          <w:color w:val="5B616B"/>
-        </w:rPr>
-        <w:t>SW4, SW5</w:t>
-      </w:r>
-      <w:r>
-        <w:rPr>
-          <w:rFonts w:ascii="TH Sarabun New" w:hAnsi="TH Sarabun New" w:cs="TH Sarabun New" w:eastAsia="TH Sarabun New"/>
-          <w:b w:val="0"/>
-          <w:i/>
-          <w:color w:val="5B616B"/>
-        </w:rPr>
-        <w:t xml:space="preserve">) โค้ดวันนี้ถามชื่อปุ่มจากเฟิร์มแวร์ด้วย </w:t>
-      </w:r>
-      <w:r>
-        <w:rPr>
-          <w:rFonts w:ascii="Consolas" w:hAnsi="Consolas" w:cs="Consolas" w:eastAsia="Consolas"/>
-          <w:b w:val="0"/>
-          <w:i/>
-          <w:color w:val="5B616B"/>
-          <w:sz w:val="21"/>
-        </w:rPr>
-        <w:t>buttons.name(0)</w:t>
-      </w:r>
-      <w:r>
-        <w:rPr>
-          <w:rFonts w:ascii="TH Sarabun New" w:hAnsi="TH Sarabun New" w:cs="TH Sarabun New" w:eastAsia="TH Sarabun New"/>
-          <w:b w:val="0"/>
-          <w:i/>
-          <w:color w:val="5B616B"/>
-        </w:rPr>
-        <w:t xml:space="preserve"> / </w:t>
-      </w:r>
-      <w:r>
-        <w:rPr>
-          <w:rFonts w:ascii="Consolas" w:hAnsi="Consolas" w:cs="Consolas" w:eastAsia="Consolas"/>
-          <w:b w:val="0"/>
-          <w:i/>
-          <w:color w:val="5B616B"/>
-          <w:sz w:val="21"/>
-        </w:rPr>
-        <w:t>buttons.name(1)</w:t>
       </w:r>
       <w:r>
         <w:rPr>
@@ -2415,7 +2461,7 @@
           <w:i/>
           <w:color w:val="5B616B"/>
         </w:rPr>
-        <w:t>widget บนจอที่ได้เจอวันนี้: หน้าปัดมีเข็ม (Scale) · วงแหวน (Arc) · ไฟสถานะ (Led) · กราฟ (Chart) · วงล้อเลือก (Roller) · สวิตช์ (Switch) · วงหมุน (Spinner) · แท็บ (Tabview) · ตาราง (Table)</w:t>
+        <w:t>widget บนจอที่ได้เจอวันนี้: หน้าปัดมีเข็ม (Scale) · วงแหวน (Arc) · ไฟสถานะ (Led) · กราฟ (Chart) · วงล้อเลือก (Roller) · สวิตช์ (Switch) · แท็บ (Tabview) · ตาราง (Table)</w:t>
       </w:r>
     </w:p>
     <w:p>
@@ -2623,7 +2669,7 @@
                 <w:b w:val="0"/>
                 <w:i w:val="0"/>
               </w:rPr>
-              <w:t>0:00–0:20</w:t>
+              <w:t>0:00–0:30</w:t>
             </w:r>
           </w:p>
         </w:tc>
@@ -2652,7 +2698,7 @@
                 <w:b w:val="0"/>
                 <w:i w:val="0"/>
               </w:rPr>
-              <w:t>เปิดคาบ: AIoT ในฟาร์มจริง + เตรียมบอร์ด</w:t>
+              <w:t>เปิดคาบ: AIoT ในฟาร์มจริง (10 นาที) + ติดตั้ง Programmer และแฟลช v2.4.1 (20 นาที)</w:t>
             </w:r>
           </w:p>
         </w:tc>
@@ -2745,7 +2791,7 @@
                 <w:b w:val="0"/>
                 <w:i w:val="0"/>
               </w:rPr>
-              <w:t>0:20–0:50</w:t>
+              <w:t>0:30–1:00</w:t>
             </w:r>
           </w:p>
         </w:tc>
@@ -2870,7 +2916,7 @@
                 <w:b w:val="0"/>
                 <w:i w:val="0"/>
               </w:rPr>
-              <w:t>0:50–1:20</w:t>
+              <w:t>1:00–1:30</w:t>
             </w:r>
           </w:p>
         </w:tc>
@@ -2993,7 +3039,7 @@
                 <w:b w:val="0"/>
                 <w:i w:val="0"/>
               </w:rPr>
-              <w:t>1:20–1:30</w:t>
+              <w:t>1:30–1:40</w:t>
             </w:r>
           </w:p>
         </w:tc>
@@ -3101,7 +3147,7 @@
                 <w:b w:val="0"/>
                 <w:i w:val="0"/>
               </w:rPr>
-              <w:t>1:30–2:00</w:t>
+              <w:t>1:40–2:10</w:t>
             </w:r>
           </w:p>
         </w:tc>
@@ -3224,7 +3270,7 @@
                 <w:b w:val="0"/>
                 <w:i w:val="0"/>
               </w:rPr>
-              <w:t>2:00–2:20</w:t>
+              <w:t>2:10–2:30</w:t>
             </w:r>
           </w:p>
         </w:tc>
@@ -3349,7 +3395,7 @@
                 <w:b w:val="0"/>
                 <w:i w:val="0"/>
               </w:rPr>
-              <w:t>2:20–2:50</w:t>
+              <w:t>2:30–2:50</w:t>
             </w:r>
           </w:p>
         </w:tc>
@@ -3659,7 +3705,7 @@
           <w:b w:val="0"/>
           <w:i w:val="0"/>
         </w:rPr>
-        <w:t xml:space="preserve"> (บอร์ดจริงอ่านได้ราว 35-36 C ในห้องแอร์ที่ปกติ ~25-28 C) ถ้าไม่ชดเชย ทุกไฟล์จะบอกว่า "ร้อนไป" ตลอด</w:t>
+        <w:t xml:space="preserve"> (บอร์ดจริงอ่านได้ราว 35-36 C ในห้องแอร์ที่ปกติ ~25-28 C ค่าชดเชยจึงมักอยู่ราว −9 ถึง −10) ถ้าไม่ชดเชย ทุกไฟล์จะบอกว่า "ร้อนไป" ตลอด</w:t>
       </w:r>
     </w:p>
     <w:p>
@@ -3689,7 +3735,23 @@
           <w:b w:val="0"/>
           <w:i w:val="0"/>
         </w:rPr>
-        <w:t xml:space="preserve"> ในการ์ดอุณหภูมิ แล้วเทียบกับเทอร์โมมิเตอร์ในห้อง หรือแอปพยากรณ์อากาศในโทรศัพท์</w:t>
+        <w:t xml:space="preserve"> ในการ์ดอุณหภูมิ แล้วเทียบกับ </w:t>
+      </w:r>
+      <w:r>
+        <w:rPr>
+          <w:rFonts w:ascii="TH Sarabun New" w:hAnsi="TH Sarabun New" w:cs="TH Sarabun New" w:eastAsia="TH Sarabun New"/>
+          <w:b/>
+          <w:i w:val="0"/>
+        </w:rPr>
+        <w:t>เทอร์โมมิเตอร์ในห้อง หรืออุณหภูมิที่ผู้สอนประกาศ</w:t>
+      </w:r>
+      <w:r>
+        <w:rPr>
+          <w:rFonts w:ascii="TH Sarabun New" w:hAnsi="TH Sarabun New" w:cs="TH Sarabun New" w:eastAsia="TH Sarabun New"/>
+          <w:b w:val="0"/>
+          <w:i w:val="0"/>
+        </w:rPr>
+        <w:t xml:space="preserve"> (ห้ามใช้แอปพยากรณ์อากาศ เพราะนั่นคืออุณหภูมินอกอาคาร)</w:t>
       </w:r>
     </w:p>
     <w:p>
@@ -3751,7 +3813,24 @@
           <w:b w:val="0"/>
           <w:i w:val="0"/>
         </w:rPr>
-        <w:t xml:space="preserve">[ ] สังเกต: ค่า "ดิบ" ไม่เปลี่ยน แต่เข็ม เลขใหญ่ และสีเปลี่ยน · จดค่านี้ไว้ </w:t>
+        <w:t xml:space="preserve">[ ] สังเกต: ค่า "ดิบ" ไม่เปลี่ยน แต่เข็ม เลขใหญ่ และสีเปลี่ยน · ความชื้นก็ถูกแปลงเป็นของห้องให้เอง (อากาศรอบเซนเซอร์อุ่นกว่าห้อง ความชื้นสัมพัทธ์จึงอ่านได้ต่ำกว่าห้อง) ถ้าเทียบไฮโกรมิเตอร์ในห้องแล้วค่าที่แปลงสูงเกินจริง ให้ตั้ง </w:t>
+      </w:r>
+      <w:r>
+        <w:rPr>
+          <w:rFonts w:ascii="Consolas" w:hAnsi="Consolas" w:cs="Consolas" w:eastAsia="Consolas"/>
+          <w:b w:val="0"/>
+          <w:i w:val="0"/>
+          <w:sz w:val="21"/>
+        </w:rPr>
+        <w:t>HUM_FIX = False</w:t>
+      </w:r>
+      <w:r>
+        <w:rPr>
+          <w:rFonts w:ascii="TH Sarabun New" w:hAnsi="TH Sarabun New" w:cs="TH Sarabun New" w:eastAsia="TH Sarabun New"/>
+          <w:b w:val="0"/>
+          <w:i w:val="0"/>
+        </w:rPr>
+        <w:t xml:space="preserve"> · จดค่านี้ไว้ </w:t>
       </w:r>
       <w:r>
         <w:rPr>
@@ -3987,7 +4066,7 @@
                 <w:b w:val="0"/>
                 <w:i w:val="0"/>
               </w:rPr>
-              <w:t>☐ เทอร์โมมิเตอร์ ☐ แอปอากาศ</w:t>
+              <w:t>☐ เทอร์โมมิเตอร์ในห้อง ☐ ผู้สอนประกาศ</w:t>
             </w:r>
           </w:p>
         </w:tc>
@@ -4068,7 +4147,7 @@
           <w:b/>
           <w:i w:val="0"/>
         </w:rPr>
-        <w:t>SW4</w:t>
+        <w:t>SW5 (ปุ่มล่าง)</w:t>
       </w:r>
       <w:r>
         <w:rPr>
@@ -5491,7 +5570,7 @@
           <w:b/>
           <w:i w:val="0"/>
         </w:rPr>
-        <w:t>SW4</w:t>
+        <w:t>SW5 (ปุ่มล่าง)</w:t>
       </w:r>
       <w:r>
         <w:rPr>
@@ -5507,7 +5586,7 @@
           <w:b/>
           <w:i w:val="0"/>
         </w:rPr>
-        <w:t>SW5</w:t>
+        <w:t>SW6 (ปุ่มบน)</w:t>
       </w:r>
       <w:r>
         <w:rPr>
@@ -6130,7 +6209,7 @@
           <w:b w:val="0"/>
           <w:i w:val="0"/>
         </w:rPr>
-        <w:t xml:space="preserve"> แล้วหมุน VR1 ลงจนดินแห้ง ปั๊มเปิดเองไหม? กด SW4 ค้างล่ะ? ฟาร์มจริงต้องมีโหมดมือไว้ทำไม?</w:t>
+        <w:t xml:space="preserve"> แล้วหมุน VR1 ลงจนดินแห้ง ปั๊มเปิดเองไหม? กด SW5 (ปุ่มล่าง) ค้างล่ะ? ฟาร์มจริงต้องมีโหมดมือไว้ทำไม?</w:t>
       </w:r>
     </w:p>
     <w:p>
@@ -6154,7 +6233,7 @@
           <w:b w:val="0"/>
           <w:i w:val="0"/>
         </w:rPr>
-        <w:t>[ ] หมุน VR3 ลงจนถังเหลือน้อยกว่า 10 % ขณะปั๊มเปิด เกิดอะไรขึ้น (จอ / ไฟ / เสียง)? กด SW4 แล้วปั๊มยอมเดินไหม เพราะอะไร?</w:t>
+        <w:t>[ ] หมุน VR3 ลงจนถังเหลือน้อยกว่า 10 % ขณะปั๊มเปิด เกิดอะไรขึ้น (จอ / ไฟ / เสียง)? กด SW5 (ปุ่มล่าง) แล้วปั๊มยอมเดินไหม เพราะอะไร?</w:t>
       </w:r>
     </w:p>
     <w:p>
@@ -6243,7 +6322,7 @@
           <w:b/>
           <w:i w:val="0"/>
         </w:rPr>
-        <w:t>SW4</w:t>
+        <w:t>SW5 (ปุ่มล่าง)</w:t>
       </w:r>
       <w:r>
         <w:rPr>
@@ -6348,7 +6427,7 @@
           <w:b/>
           <w:i w:val="0"/>
         </w:rPr>
-        <w:t>SW5</w:t>
+        <w:t>SW6 (ปุ่มบน)</w:t>
       </w:r>
       <w:r>
         <w:rPr>
@@ -6652,7 +6731,7 @@
           <w:b/>
           <w:i w:val="0"/>
         </w:rPr>
-        <w:t>SW5</w:t>
+        <w:t>SW6 (ปุ่มบน)</w:t>
       </w:r>
       <w:r>
         <w:rPr>
@@ -6668,7 +6747,7 @@
           <w:b/>
           <w:i w:val="0"/>
         </w:rPr>
-        <w:t>SW4</w:t>
+        <w:t>SW5 (ปุ่มล่าง)</w:t>
       </w:r>
       <w:r>
         <w:rPr>
@@ -7646,7 +7725,7 @@
           <w:b w:val="0"/>
           <w:i w:val="0"/>
         </w:rPr>
-        <w:t xml:space="preserve"> (ลูกบิด VR1-VR4 ปุ่ม SW4/SW5 และจอไฟ RGB — ไม่ใช่แถบ POTEN ของ Eva Kit) กับแผงเซนเซอร์ แทนการเป่าลม/หมุนลูกบิด/กดปุ่ม ค่าใน Emulator เป็นค่าจำลอง ตัวเลขจึงไม่เหมือนบอร์ดจริง ลองแก้ </w:t>
+        <w:t xml:space="preserve"> (ลูกบิด VR1-VR4 ปุ่มสองปุ่ม และจอไฟ RGB — แผงนี้ยังเขียนชื่อปุ่มว่า SW4/SW5 ซึ่งคือ SW5 ปุ่มล่าง / SW6 ปุ่มบน ของบอร์ดจริงตามลำดับ — ไม่ใช่แถบ POTEN ของ Eva Kit) กับแผงเซนเซอร์ แทนการเป่าลม/หมุนลูกบิด/กดปุ่ม ค่าใน Emulator เป็นค่าจำลอง ตัวเลขจึงไม่เหมือนบอร์ดจริง ลองแก้ </w:t>
       </w:r>
       <w:r>
         <w:rPr>

</xml_diff>

<commit_message>
session1: Remote Flash step names the firmware exactly as the IDE shows it
</commit_message>
<xml_diff>
--- a/s1/sf-s1-th.docx
+++ b/s1/sf-s1-th.docx
@@ -569,7 +569,7 @@
           <w:b/>
           <w:i w:val="0"/>
         </w:rPr>
-        <w:t>BENTO MicroPython — TESAIoT Dev Kit v2.4.1</w:t>
+        <w:t>BENTO Firmware — TESAIoT Dev Kit</w:t>
       </w:r>
       <w:r>
         <w:rPr>
@@ -577,7 +577,23 @@
           <w:b w:val="0"/>
           <w:i w:val="0"/>
         </w:rPr>
-        <w:t xml:space="preserve"> → จับคู่กับ Programmer ตามที่หน้าจอบอก → </w:t>
+        <w:t xml:space="preserve"> แล้วกด </w:t>
+      </w:r>
+      <w:r>
+        <w:rPr>
+          <w:rFonts w:ascii="TH Sarabun New" w:hAnsi="TH Sarabun New" w:cs="TH Sarabun New" w:eastAsia="TH Sarabun New"/>
+          <w:b/>
+          <w:i w:val="0"/>
+        </w:rPr>
+        <w:t>Flash this board →</w:t>
+      </w:r>
+      <w:r>
+        <w:rPr>
+          <w:rFonts w:ascii="TH Sarabun New" w:hAnsi="TH Sarabun New" w:cs="TH Sarabun New" w:eastAsia="TH Sarabun New"/>
+          <w:b w:val="0"/>
+          <w:i w:val="0"/>
+        </w:rPr>
+        <w:t xml:space="preserve"> (รุ่น v2.4.1) → จับคู่กับ Programmer ตามที่หน้าจอบอก → </w:t>
       </w:r>
       <w:r>
         <w:rPr>

</xml_diff>

<commit_message>
session1: SW5 starts and stops manual watering with a single press
Holding SW5 to water was hard to see working. One press now starts
manual watering for MANUAL_S seconds (10 by default) and a second press
stops it; it also stops by itself when the time is up, so a forgotten
pump does not run on. sf1_03, its practise file and solution, and sf1_05
change together, and the worksheet and slides describe the new press.
</commit_message>
<xml_diff>
--- a/s1/sf-s1-th.docx
+++ b/s1/sf-s1-th.docx
@@ -9345,7 +9345,7 @@
           <w:b w:val="0"/>
           <w:i w:val="0"/>
         </w:rPr>
-        <w:t xml:space="preserve"> กดค้าง = รดน้ำเอง · </w:t>
+        <w:t xml:space="preserve"> กดหนึ่งครั้ง = รดน้ำเอง 10 วินาที (กดอีกครั้ง = หยุด) · </w:t>
       </w:r>
       <w:r>
         <w:rPr>
@@ -9976,7 +9976,7 @@
           <w:b w:val="0"/>
           <w:i w:val="0"/>
         </w:rPr>
-        <w:t xml:space="preserve"> แล้วหมุน VR1 ลงจนดินแห้ง ปั๊มเปิดเองไหม? กด SW5 (ปุ่มล่าง) ค้างล่ะ? ฟาร์มจริงต้องมีโหมดมือไว้ทำไม?</w:t>
+        <w:t xml:space="preserve"> แล้วหมุน VR1 ลงจนดินแห้ง ปั๊มเปิดเองไหม? กด SW5 (ปุ่มล่าง) หนึ่งครั้งล่ะ? ฟาร์มจริงต้องมีโหมดมือไว้ทำไม?</w:t>
       </w:r>
     </w:p>
     <w:p>
@@ -10520,7 +10520,7 @@
           <w:b w:val="0"/>
           <w:i w:val="0"/>
         </w:rPr>
-        <w:t xml:space="preserve"> ค้าง = รดน้ำเอง</w:t>
+        <w:t xml:space="preserve"> = เริ่ม/หยุดรดน้ำเอง</w:t>
       </w:r>
     </w:p>
     <w:p>

</xml_diff>

<commit_message>
session1: slides and worksheet describe beep() at about 20% instead of ui.sfx
</commit_message>
<xml_diff>
--- a/s1/sf-s1-th.docx
+++ b/s1/sf-s1-th.docx
@@ -1616,7 +1616,7 @@
                 <w:i w:val="0"/>
                 <w:sz w:val="21"/>
               </w:rPr>
-              <w:t>ui.sfx(...)</w:t>
+              <w:t>beep("tap")</w:t>
             </w:r>
             <w:r>
               <w:rPr>
@@ -1624,7 +1624,7 @@
                 <w:b w:val="0"/>
                 <w:i w:val="0"/>
               </w:rPr>
-              <w:t xml:space="preserve">, </w:t>
+              <w:t xml:space="preserve"> → </w:t>
             </w:r>
             <w:r>
               <w:rPr>
@@ -1634,6 +1634,31 @@
                 <w:sz w:val="21"/>
               </w:rPr>
               <w:t>ui.tone(...)</w:t>
+            </w:r>
+            <w:r>
+              <w:rPr>
+                <w:rFonts w:ascii="TH Sarabun New" w:hAnsi="TH Sarabun New" w:cs="TH Sarabun New" w:eastAsia="TH Sarabun New"/>
+                <w:b w:val="0"/>
+                <w:i w:val="0"/>
+              </w:rPr>
+              <w:t xml:space="preserve"> ความดังตั้งที่ </w:t>
+            </w:r>
+            <w:r>
+              <w:rPr>
+                <w:rFonts w:ascii="Consolas" w:hAnsi="Consolas" w:cs="Consolas" w:eastAsia="Consolas"/>
+                <w:b w:val="0"/>
+                <w:i w:val="0"/>
+                <w:sz w:val="21"/>
+              </w:rPr>
+              <w:t>VOLUME</w:t>
+            </w:r>
+            <w:r>
+              <w:rPr>
+                <w:rFonts w:ascii="TH Sarabun New" w:hAnsi="TH Sarabun New" w:cs="TH Sarabun New" w:eastAsia="TH Sarabun New"/>
+                <w:b w:val="0"/>
+                <w:i w:val="0"/>
+              </w:rPr>
+              <w:t xml:space="preserve"> (≈20%)</w:t>
             </w:r>
           </w:p>
         </w:tc>

</xml_diff>

<commit_message>
session1: master speaker level SPEAKER = 40 via ui.volume(); flash the latest firmware
Board-imported on the released firmware 2.4.2 (10:42-10:49): sf1_04 and the
practise solution 3/3, the other four files 1/1.
</commit_message>
<xml_diff>
--- a/s1/sf-s1-th.docx
+++ b/s1/sf-s1-th.docx
@@ -593,7 +593,7 @@
           <w:b w:val="0"/>
           <w:i w:val="0"/>
         </w:rPr>
-        <w:t xml:space="preserve"> (รุ่น v2.4.1) → จับคู่กับ Programmer ตามที่หน้าจอบอก → </w:t>
+        <w:t xml:space="preserve"> (เวอร์ชันล่าสุด) → จับคู่กับ Programmer ตามที่หน้าจอบอก → </w:t>
       </w:r>
       <w:r>
         <w:rPr>
@@ -623,7 +623,15 @@
           <w:b/>
           <w:i w:val="0"/>
         </w:rPr>
-        <w:t>v2.4.1</w:t>
+        <w:t>v2.4.2</w:t>
+      </w:r>
+      <w:r>
+        <w:rPr>
+          <w:rFonts w:ascii="TH Sarabun New" w:hAnsi="TH Sarabun New" w:cs="TH Sarabun New" w:eastAsia="TH Sarabun New"/>
+          <w:b w:val="0"/>
+          <w:i w:val="0"/>
+        </w:rPr>
+        <w:t xml:space="preserve"> หรือใหม่กว่า</w:t>
       </w:r>
     </w:p>
     <w:p>
@@ -1641,7 +1649,24 @@
                 <w:b w:val="0"/>
                 <w:i w:val="0"/>
               </w:rPr>
-              <w:t xml:space="preserve"> ความดังตั้งที่ </w:t>
+              <w:t xml:space="preserve"> ความดังรวมตั้งที่ </w:t>
+            </w:r>
+            <w:r>
+              <w:rPr>
+                <w:rFonts w:ascii="Consolas" w:hAnsi="Consolas" w:cs="Consolas" w:eastAsia="Consolas"/>
+                <w:b w:val="0"/>
+                <w:i w:val="0"/>
+                <w:sz w:val="21"/>
+              </w:rPr>
+              <w:t>SPEAKER</w:t>
+            </w:r>
+            <w:r>
+              <w:rPr>
+                <w:rFonts w:ascii="TH Sarabun New" w:hAnsi="TH Sarabun New" w:cs="TH Sarabun New" w:eastAsia="TH Sarabun New"/>
+                <w:b w:val="0"/>
+                <w:i w:val="0"/>
+              </w:rPr>
+              <w:t xml:space="preserve"> (40%) และแต่ละเสียงที่ </w:t>
             </w:r>
             <w:r>
               <w:rPr>
@@ -2739,7 +2764,7 @@
                 <w:b w:val="0"/>
                 <w:i w:val="0"/>
               </w:rPr>
-              <w:t>เปิดคาบ: AIoT ในฟาร์มจริง (10 นาที) + ติดตั้ง Programmer และแฟลช v2.4.1 (20 นาที)</w:t>
+              <w:t>เปิดคาบ: AIoT ในฟาร์มจริง (10 นาที) + ติดตั้ง Programmer และแฟลชเฟิร์มแวร์ล่าสุด (20 นาที)</w:t>
             </w:r>
           </w:p>
         </w:tc>

</xml_diff>